<commit_message>
Avances en la memoria y diagrama de gantt
Justificacion e introducion del proyecto y nuevas tareas en el diagrama
</commit_message>
<xml_diff>
--- a/TFG/Memoria_TFG 2025-26.docx
+++ b/TFG/Memoria_TFG 2025-26.docx
@@ -34,7 +34,7 @@
           <w:lang w:eastAsia="es-ES"/>
         </w:rPr>
         <w:drawing>
-          <wp:inline distT="0" distB="0" distL="0" distR="0" wp14:anchorId="19882AF8" wp14:editId="70DEAFF3">
+          <wp:inline distT="0" distB="0" distL="0" distR="0" wp14:anchorId="19882AF8" wp14:editId="19493A80">
             <wp:extent cx="3524250" cy="1771650"/>
             <wp:effectExtent l="0" t="0" r="0" b="0"/>
             <wp:docPr id="923855780" name="Imagen 923855780"/>
@@ -259,77 +259,594 @@
           <w:sz w:val="32"/>
           <w:szCs w:val="32"/>
         </w:rPr>
-        <w:t>Tutor</w:t>
-      </w:r>
-      <w:r>
+        <w:t>Julián del Castillo Pintado</w:t>
+      </w:r>
+    </w:p>
+    <w:p>
+      <w:pPr>
+        <w:rPr>
+          <w:color w:val="000000" w:themeColor="text1"/>
+        </w:rPr>
+      </w:pPr>
+      <w:r>
+        <w:rPr>
+          <w:color w:val="000000" w:themeColor="text1"/>
+        </w:rPr>
+        <w:br w:type="page"/>
+      </w:r>
+    </w:p>
+    <w:p>
+      <w:pPr>
+        <w:spacing w:line="360" w:lineRule="auto"/>
+        <w:jc w:val="right"/>
         <w:rPr>
           <w:rFonts w:ascii="Arial" w:hAnsi="Arial" w:cs="Arial"/>
           <w:color w:val="000000" w:themeColor="text1"/>
           <w:sz w:val="32"/>
           <w:szCs w:val="32"/>
         </w:rPr>
-        <w:t xml:space="preserve"> del TFG</w:t>
-      </w:r>
-    </w:p>
-    <w:p>
-      <w:pPr>
-        <w:rPr>
-          <w:color w:val="000000" w:themeColor="text1"/>
-        </w:rPr>
-      </w:pPr>
-      <w:r>
-        <w:rPr>
-          <w:color w:val="000000" w:themeColor="text1"/>
-        </w:rPr>
-        <w:br w:type="page"/>
-      </w:r>
-    </w:p>
-    <w:p>
-      <w:pPr>
-        <w:spacing w:line="360" w:lineRule="auto"/>
-        <w:jc w:val="right"/>
+      </w:pPr>
+      <w:r>
         <w:rPr>
           <w:rFonts w:ascii="Arial" w:hAnsi="Arial" w:cs="Arial"/>
           <w:color w:val="000000" w:themeColor="text1"/>
           <w:sz w:val="32"/>
           <w:szCs w:val="32"/>
         </w:rPr>
-      </w:pPr>
-      <w:r>
+        <w:lastRenderedPageBreak/>
+        <w:t>DEDICATORIA (OPCIONAL)</w:t>
+      </w:r>
+    </w:p>
+    <w:p>
+      <w:pPr>
+        <w:spacing w:line="360" w:lineRule="auto"/>
+        <w:rPr>
+          <w:color w:val="000000" w:themeColor="text1"/>
+        </w:rPr>
+      </w:pPr>
+      <w:r>
+        <w:rPr>
+          <w:color w:val="000000" w:themeColor="text1"/>
+        </w:rPr>
+        <w:br w:type="page"/>
+      </w:r>
+    </w:p>
+    <w:p>
+      <w:pPr>
+        <w:spacing w:line="360" w:lineRule="auto"/>
+        <w:jc w:val="both"/>
         <w:rPr>
           <w:rFonts w:ascii="Arial" w:hAnsi="Arial" w:cs="Arial"/>
           <w:color w:val="000000" w:themeColor="text1"/>
           <w:sz w:val="32"/>
           <w:szCs w:val="32"/>
         </w:rPr>
-        <w:lastRenderedPageBreak/>
-        <w:t>DEDICATORIA (OPCIONAL)</w:t>
-      </w:r>
-    </w:p>
-    <w:p>
-      <w:pPr>
-        <w:spacing w:line="360" w:lineRule="auto"/>
-        <w:rPr>
-          <w:color w:val="000000" w:themeColor="text1"/>
-        </w:rPr>
-      </w:pPr>
-      <w:r>
-        <w:rPr>
-          <w:color w:val="000000" w:themeColor="text1"/>
-        </w:rPr>
-        <w:br w:type="page"/>
-      </w:r>
-    </w:p>
-    <w:p>
-      <w:pPr>
-        <w:spacing w:line="360" w:lineRule="auto"/>
-        <w:jc w:val="both"/>
+      </w:pPr>
+      <w:r>
         <w:rPr>
           <w:rFonts w:ascii="Arial" w:hAnsi="Arial" w:cs="Arial"/>
           <w:color w:val="000000" w:themeColor="text1"/>
           <w:sz w:val="32"/>
           <w:szCs w:val="32"/>
         </w:rPr>
+        <w:lastRenderedPageBreak/>
+        <w:t>ÍNDICES</w:t>
+      </w:r>
+    </w:p>
+    <w:p>
+      <w:pPr>
+        <w:spacing w:line="360" w:lineRule="auto"/>
+        <w:jc w:val="both"/>
+        <w:rPr>
+          <w:rFonts w:ascii="Arial" w:hAnsi="Arial" w:cs="Arial"/>
+          <w:color w:val="000000" w:themeColor="text1"/>
+        </w:rPr>
+      </w:pPr>
+      <w:r>
+        <w:rPr>
+          <w:rFonts w:ascii="Arial" w:hAnsi="Arial" w:cs="Arial"/>
+          <w:color w:val="000000" w:themeColor="text1"/>
+        </w:rPr>
+        <w:t>De contenido, tablas e ilustraciones.</w:t>
+      </w:r>
+      <w:r>
+        <w:rPr>
+          <w:rFonts w:ascii="Arial" w:hAnsi="Arial" w:cs="Arial"/>
+          <w:color w:val="000000" w:themeColor="text1"/>
+        </w:rPr>
+        <w:t xml:space="preserve"> Se recomienda realizarlos de manera automática.</w:t>
+      </w:r>
+    </w:p>
+    <w:p>
+      <w:pPr>
+        <w:spacing w:line="360" w:lineRule="auto"/>
+        <w:jc w:val="both"/>
+        <w:rPr>
+          <w:rFonts w:ascii="Arial" w:hAnsi="Arial" w:cs="Arial"/>
+          <w:color w:val="000000" w:themeColor="text1"/>
+        </w:rPr>
+      </w:pPr>
+      <w:r>
+        <w:rPr>
+          <w:rFonts w:ascii="Arial" w:hAnsi="Arial" w:cs="Arial"/>
+          <w:color w:val="000000" w:themeColor="text1"/>
+        </w:rPr>
+        <w:t>Índice</w:t>
+      </w:r>
+    </w:p>
+    <w:p>
+      <w:pPr>
+        <w:spacing w:line="360" w:lineRule="auto"/>
+        <w:jc w:val="both"/>
+        <w:rPr>
+          <w:rFonts w:ascii="Arial" w:hAnsi="Arial" w:cs="Arial"/>
+          <w:color w:val="000000" w:themeColor="text1"/>
+        </w:rPr>
+      </w:pPr>
+      <w:r>
+        <w:rPr>
+          <w:rFonts w:ascii="Arial" w:hAnsi="Arial" w:cs="Arial"/>
+          <w:color w:val="000000" w:themeColor="text1"/>
+        </w:rPr>
+        <w:t>Ilustraciones</w:t>
+      </w:r>
+    </w:p>
+    <w:p>
+      <w:pPr>
+        <w:pStyle w:val="Tabladeilustraciones"/>
+        <w:tabs>
+          <w:tab w:val="right" w:leader="dot" w:pos="9016"/>
+        </w:tabs>
+        <w:rPr>
+          <w:noProof/>
+        </w:rPr>
+      </w:pPr>
+      <w:r>
+        <w:rPr>
+          <w:color w:val="000000" w:themeColor="text1"/>
+        </w:rPr>
+        <w:fldChar w:fldCharType="begin"/>
+      </w:r>
+      <w:r>
+        <w:rPr>
+          <w:color w:val="000000" w:themeColor="text1"/>
+        </w:rPr>
+        <w:instrText xml:space="preserve"> TOC \h \z \c "Ilustración" </w:instrText>
+      </w:r>
+      <w:r>
+        <w:rPr>
+          <w:color w:val="000000" w:themeColor="text1"/>
+        </w:rPr>
+        <w:fldChar w:fldCharType="separate"/>
+      </w:r>
+      <w:hyperlink w:anchor="_Toc223685188" w:history="1">
+        <w:r>
+          <w:rPr>
+            <w:rStyle w:val="Hipervnculo"/>
+            <w:rFonts w:ascii="Arial" w:hAnsi="Arial" w:cs="Arial"/>
+            <w:noProof/>
+          </w:rPr>
+          <w:t>Ilustración 1 VirtualBox</w:t>
+        </w:r>
+        <w:r>
+          <w:rPr>
+            <w:noProof/>
+            <w:webHidden/>
+          </w:rPr>
+          <w:tab/>
+        </w:r>
+        <w:r>
+          <w:rPr>
+            <w:noProof/>
+            <w:webHidden/>
+          </w:rPr>
+          <w:fldChar w:fldCharType="begin"/>
+        </w:r>
+        <w:r>
+          <w:rPr>
+            <w:noProof/>
+            <w:webHidden/>
+          </w:rPr>
+          <w:instrText xml:space="preserve"> PAGEREF _Toc223685188 \h </w:instrText>
+        </w:r>
+        <w:r>
+          <w:rPr>
+            <w:noProof/>
+            <w:webHidden/>
+          </w:rPr>
+        </w:r>
+        <w:r>
+          <w:rPr>
+            <w:noProof/>
+            <w:webHidden/>
+          </w:rPr>
+          <w:fldChar w:fldCharType="separate"/>
+        </w:r>
+        <w:r>
+          <w:rPr>
+            <w:noProof/>
+            <w:webHidden/>
+          </w:rPr>
+          <w:t>15</w:t>
+        </w:r>
+        <w:r>
+          <w:rPr>
+            <w:noProof/>
+            <w:webHidden/>
+          </w:rPr>
+          <w:fldChar w:fldCharType="end"/>
+        </w:r>
+      </w:hyperlink>
+    </w:p>
+    <w:p>
+      <w:pPr>
+        <w:pStyle w:val="Tabladeilustraciones"/>
+        <w:tabs>
+          <w:tab w:val="right" w:leader="dot" w:pos="9016"/>
+        </w:tabs>
+        <w:rPr>
+          <w:noProof/>
+        </w:rPr>
+      </w:pPr>
+      <w:hyperlink w:anchor="_Toc223685189" w:history="1">
+        <w:r>
+          <w:rPr>
+            <w:rStyle w:val="Hipervnculo"/>
+            <w:rFonts w:ascii="Arial" w:hAnsi="Arial" w:cs="Arial"/>
+            <w:noProof/>
+          </w:rPr>
+          <w:t>Ilustración 2 WordPress</w:t>
+        </w:r>
+        <w:r>
+          <w:rPr>
+            <w:noProof/>
+            <w:webHidden/>
+          </w:rPr>
+          <w:tab/>
+        </w:r>
+        <w:r>
+          <w:rPr>
+            <w:noProof/>
+            <w:webHidden/>
+          </w:rPr>
+          <w:fldChar w:fldCharType="begin"/>
+        </w:r>
+        <w:r>
+          <w:rPr>
+            <w:noProof/>
+            <w:webHidden/>
+          </w:rPr>
+          <w:instrText xml:space="preserve"> PAGEREF _Toc223685189 \h </w:instrText>
+        </w:r>
+        <w:r>
+          <w:rPr>
+            <w:noProof/>
+            <w:webHidden/>
+          </w:rPr>
+        </w:r>
+        <w:r>
+          <w:rPr>
+            <w:noProof/>
+            <w:webHidden/>
+          </w:rPr>
+          <w:fldChar w:fldCharType="separate"/>
+        </w:r>
+        <w:r>
+          <w:rPr>
+            <w:noProof/>
+            <w:webHidden/>
+          </w:rPr>
+          <w:t>15</w:t>
+        </w:r>
+        <w:r>
+          <w:rPr>
+            <w:noProof/>
+            <w:webHidden/>
+          </w:rPr>
+          <w:fldChar w:fldCharType="end"/>
+        </w:r>
+      </w:hyperlink>
+    </w:p>
+    <w:p>
+      <w:pPr>
+        <w:pStyle w:val="Tabladeilustraciones"/>
+        <w:tabs>
+          <w:tab w:val="right" w:leader="dot" w:pos="9016"/>
+        </w:tabs>
+        <w:rPr>
+          <w:noProof/>
+        </w:rPr>
+      </w:pPr>
+      <w:hyperlink w:anchor="_Toc223685190" w:history="1">
+        <w:r>
+          <w:rPr>
+            <w:rStyle w:val="Hipervnculo"/>
+            <w:rFonts w:ascii="Arial" w:hAnsi="Arial" w:cs="Arial"/>
+            <w:noProof/>
+          </w:rPr>
+          <w:t>Ilustración 3 Active Directory</w:t>
+        </w:r>
+        <w:r>
+          <w:rPr>
+            <w:noProof/>
+            <w:webHidden/>
+          </w:rPr>
+          <w:tab/>
+        </w:r>
+        <w:r>
+          <w:rPr>
+            <w:noProof/>
+            <w:webHidden/>
+          </w:rPr>
+          <w:fldChar w:fldCharType="begin"/>
+        </w:r>
+        <w:r>
+          <w:rPr>
+            <w:noProof/>
+            <w:webHidden/>
+          </w:rPr>
+          <w:instrText xml:space="preserve"> PAGEREF _Toc223685190 \h </w:instrText>
+        </w:r>
+        <w:r>
+          <w:rPr>
+            <w:noProof/>
+            <w:webHidden/>
+          </w:rPr>
+        </w:r>
+        <w:r>
+          <w:rPr>
+            <w:noProof/>
+            <w:webHidden/>
+          </w:rPr>
+          <w:fldChar w:fldCharType="separate"/>
+        </w:r>
+        <w:r>
+          <w:rPr>
+            <w:noProof/>
+            <w:webHidden/>
+          </w:rPr>
+          <w:t>16</w:t>
+        </w:r>
+        <w:r>
+          <w:rPr>
+            <w:noProof/>
+            <w:webHidden/>
+          </w:rPr>
+          <w:fldChar w:fldCharType="end"/>
+        </w:r>
+      </w:hyperlink>
+    </w:p>
+    <w:p>
+      <w:pPr>
+        <w:pStyle w:val="Tabladeilustraciones"/>
+        <w:tabs>
+          <w:tab w:val="right" w:leader="dot" w:pos="9016"/>
+        </w:tabs>
+        <w:rPr>
+          <w:noProof/>
+        </w:rPr>
+      </w:pPr>
+      <w:hyperlink w:anchor="_Toc223685191" w:history="1">
+        <w:r>
+          <w:rPr>
+            <w:rStyle w:val="Hipervnculo"/>
+            <w:rFonts w:ascii="Arial" w:hAnsi="Arial" w:cs="Arial"/>
+            <w:noProof/>
+          </w:rPr>
+          <w:t>Ilustración 4 Microsoft Proyect</w:t>
+        </w:r>
+        <w:r>
+          <w:rPr>
+            <w:noProof/>
+            <w:webHidden/>
+          </w:rPr>
+          <w:tab/>
+        </w:r>
+        <w:r>
+          <w:rPr>
+            <w:noProof/>
+            <w:webHidden/>
+          </w:rPr>
+          <w:fldChar w:fldCharType="begin"/>
+        </w:r>
+        <w:r>
+          <w:rPr>
+            <w:noProof/>
+            <w:webHidden/>
+          </w:rPr>
+          <w:instrText xml:space="preserve"> PAGEREF _Toc223685191 \h </w:instrText>
+        </w:r>
+        <w:r>
+          <w:rPr>
+            <w:noProof/>
+            <w:webHidden/>
+          </w:rPr>
+        </w:r>
+        <w:r>
+          <w:rPr>
+            <w:noProof/>
+            <w:webHidden/>
+          </w:rPr>
+          <w:fldChar w:fldCharType="separate"/>
+        </w:r>
+        <w:r>
+          <w:rPr>
+            <w:noProof/>
+            <w:webHidden/>
+          </w:rPr>
+          <w:t>16</w:t>
+        </w:r>
+        <w:r>
+          <w:rPr>
+            <w:noProof/>
+            <w:webHidden/>
+          </w:rPr>
+          <w:fldChar w:fldCharType="end"/>
+        </w:r>
+      </w:hyperlink>
+    </w:p>
+    <w:p>
+      <w:pPr>
+        <w:pStyle w:val="Tabladeilustraciones"/>
+        <w:tabs>
+          <w:tab w:val="right" w:leader="dot" w:pos="9016"/>
+        </w:tabs>
+        <w:rPr>
+          <w:noProof/>
+        </w:rPr>
+      </w:pPr>
+      <w:hyperlink w:anchor="_Toc223685192" w:history="1">
+        <w:r>
+          <w:rPr>
+            <w:rStyle w:val="Hipervnculo"/>
+            <w:rFonts w:ascii="Arial" w:hAnsi="Arial" w:cs="Arial"/>
+            <w:noProof/>
+          </w:rPr>
+          <w:t>Ilustración 5 Microsoft Excel</w:t>
+        </w:r>
+        <w:r>
+          <w:rPr>
+            <w:noProof/>
+            <w:webHidden/>
+          </w:rPr>
+          <w:tab/>
+        </w:r>
+        <w:r>
+          <w:rPr>
+            <w:noProof/>
+            <w:webHidden/>
+          </w:rPr>
+          <w:fldChar w:fldCharType="begin"/>
+        </w:r>
+        <w:r>
+          <w:rPr>
+            <w:noProof/>
+            <w:webHidden/>
+          </w:rPr>
+          <w:instrText xml:space="preserve"> PAGEREF _Toc223685192 \h </w:instrText>
+        </w:r>
+        <w:r>
+          <w:rPr>
+            <w:noProof/>
+            <w:webHidden/>
+          </w:rPr>
+        </w:r>
+        <w:r>
+          <w:rPr>
+            <w:noProof/>
+            <w:webHidden/>
+          </w:rPr>
+          <w:fldChar w:fldCharType="separate"/>
+        </w:r>
+        <w:r>
+          <w:rPr>
+            <w:noProof/>
+            <w:webHidden/>
+          </w:rPr>
+          <w:t>17</w:t>
+        </w:r>
+        <w:r>
+          <w:rPr>
+            <w:noProof/>
+            <w:webHidden/>
+          </w:rPr>
+          <w:fldChar w:fldCharType="end"/>
+        </w:r>
+      </w:hyperlink>
+    </w:p>
+    <w:p>
+      <w:pPr>
+        <w:pStyle w:val="Tabladeilustraciones"/>
+        <w:tabs>
+          <w:tab w:val="right" w:leader="dot" w:pos="9016"/>
+        </w:tabs>
+        <w:rPr>
+          <w:noProof/>
+        </w:rPr>
+      </w:pPr>
+      <w:hyperlink w:anchor="_Toc223685193" w:history="1">
+        <w:r>
+          <w:rPr>
+            <w:rStyle w:val="Hipervnculo"/>
+            <w:rFonts w:ascii="Arial" w:hAnsi="Arial" w:cs="Arial"/>
+            <w:noProof/>
+          </w:rPr>
+          <w:t>Ilustración 6 Cisco Packet Tracert</w:t>
+        </w:r>
+        <w:r>
+          <w:rPr>
+            <w:noProof/>
+            <w:webHidden/>
+          </w:rPr>
+          <w:tab/>
+        </w:r>
+        <w:r>
+          <w:rPr>
+            <w:noProof/>
+            <w:webHidden/>
+          </w:rPr>
+          <w:fldChar w:fldCharType="begin"/>
+        </w:r>
+        <w:r>
+          <w:rPr>
+            <w:noProof/>
+            <w:webHidden/>
+          </w:rPr>
+          <w:instrText xml:space="preserve"> PAGEREF _Toc223685193 \h </w:instrText>
+        </w:r>
+        <w:r>
+          <w:rPr>
+            <w:noProof/>
+            <w:webHidden/>
+          </w:rPr>
+        </w:r>
+        <w:r>
+          <w:rPr>
+            <w:noProof/>
+            <w:webHidden/>
+          </w:rPr>
+          <w:fldChar w:fldCharType="separate"/>
+        </w:r>
+        <w:r>
+          <w:rPr>
+            <w:noProof/>
+            <w:webHidden/>
+          </w:rPr>
+          <w:t>17</w:t>
+        </w:r>
+        <w:r>
+          <w:rPr>
+            <w:noProof/>
+            <w:webHidden/>
+          </w:rPr>
+          <w:fldChar w:fldCharType="end"/>
+        </w:r>
+      </w:hyperlink>
+    </w:p>
+    <w:p>
+      <w:pPr>
+        <w:spacing w:line="360" w:lineRule="auto"/>
+        <w:rPr>
+          <w:color w:val="000000" w:themeColor="text1"/>
+        </w:rPr>
+      </w:pPr>
+      <w:r>
+        <w:rPr>
+          <w:color w:val="000000" w:themeColor="text1"/>
+        </w:rPr>
+        <w:fldChar w:fldCharType="end"/>
+      </w:r>
+      <w:r>
+        <w:rPr>
+          <w:color w:val="000000" w:themeColor="text1"/>
+        </w:rPr>
+        <w:br w:type="page"/>
+      </w:r>
+    </w:p>
+    <w:p>
+      <w:pPr>
+        <w:spacing w:line="360" w:lineRule="auto"/>
+        <w:jc w:val="both"/>
       </w:pPr>
       <w:r>
         <w:rPr>
@@ -339,46 +856,182 @@
           <w:szCs w:val="32"/>
         </w:rPr>
         <w:lastRenderedPageBreak/>
-        <w:t>ÍNDICES</w:t>
-      </w:r>
-    </w:p>
-    <w:p>
-      <w:pPr>
-        <w:spacing w:line="360" w:lineRule="auto"/>
-        <w:jc w:val="both"/>
-        <w:rPr>
-          <w:rFonts w:ascii="Arial" w:hAnsi="Arial" w:cs="Arial"/>
-          <w:color w:val="000000" w:themeColor="text1"/>
-        </w:rPr>
-      </w:pPr>
-      <w:r>
-        <w:rPr>
-          <w:rFonts w:ascii="Arial" w:hAnsi="Arial" w:cs="Arial"/>
-          <w:color w:val="000000" w:themeColor="text1"/>
-        </w:rPr>
-        <w:t>De contenido, tablas e ilustraciones.</w:t>
-      </w:r>
-      <w:r>
-        <w:rPr>
-          <w:rFonts w:ascii="Arial" w:hAnsi="Arial" w:cs="Arial"/>
-          <w:color w:val="000000" w:themeColor="text1"/>
-        </w:rPr>
-        <w:t xml:space="preserve"> Se recomienda realizarlos de manera automática.</w:t>
-      </w:r>
-    </w:p>
-    <w:p>
-      <w:pPr>
-        <w:spacing w:line="360" w:lineRule="auto"/>
-        <w:rPr>
-          <w:color w:val="000000" w:themeColor="text1"/>
-        </w:rPr>
-      </w:pPr>
-      <w:r>
-        <w:rPr>
-          <w:color w:val="000000" w:themeColor="text1"/>
-        </w:rPr>
-        <w:br w:type="page"/>
-      </w:r>
+        <w:t>ABSTRACT</w:t>
+      </w:r>
+      <w:r>
+        <w:tab/>
+      </w:r>
+    </w:p>
+    <w:p>
+      <w:pPr>
+        <w:spacing w:line="360" w:lineRule="auto"/>
+        <w:jc w:val="both"/>
+        <w:rPr>
+          <w:rFonts w:ascii="Arial" w:hAnsi="Arial" w:cs="Arial"/>
+          <w:color w:val="000000" w:themeColor="text1"/>
+          <w:sz w:val="24"/>
+          <w:szCs w:val="24"/>
+        </w:rPr>
+      </w:pPr>
+      <w:r>
+        <w:rPr>
+          <w:rFonts w:ascii="Arial" w:hAnsi="Arial" w:cs="Arial"/>
+          <w:color w:val="000000" w:themeColor="text1"/>
+          <w:sz w:val="24"/>
+          <w:szCs w:val="24"/>
+        </w:rPr>
+        <w:t>Español</w:t>
+      </w:r>
+    </w:p>
+    <w:p>
+      <w:pPr>
+        <w:spacing w:line="360" w:lineRule="auto"/>
+        <w:jc w:val="both"/>
+        <w:rPr>
+          <w:rFonts w:ascii="Arial" w:hAnsi="Arial" w:cs="Arial"/>
+          <w:color w:val="000000" w:themeColor="text1"/>
+        </w:rPr>
+      </w:pPr>
+      <w:r>
+        <w:rPr>
+          <w:rFonts w:ascii="Arial" w:hAnsi="Arial" w:cs="Arial"/>
+          <w:color w:val="000000" w:themeColor="text1"/>
+        </w:rPr>
+        <w:t>Este proyecto consiste en</w:t>
+      </w:r>
+      <w:r>
+        <w:rPr>
+          <w:rFonts w:ascii="Arial" w:hAnsi="Arial" w:cs="Arial"/>
+          <w:color w:val="000000" w:themeColor="text1"/>
+        </w:rPr>
+        <w:t xml:space="preserve"> el diseño y configuración</w:t>
+      </w:r>
+      <w:r>
+        <w:rPr>
+          <w:rFonts w:ascii="Arial" w:hAnsi="Arial" w:cs="Arial"/>
+          <w:color w:val="000000" w:themeColor="text1"/>
+        </w:rPr>
+        <w:t xml:space="preserve"> una red interna para un equipo de futbol dividida en 3 departamentos, </w:t>
+      </w:r>
+      <w:r>
+        <w:rPr>
+          <w:rFonts w:ascii="Arial" w:hAnsi="Arial" w:cs="Arial"/>
+          <w:color w:val="000000" w:themeColor="text1"/>
+        </w:rPr>
+        <w:t xml:space="preserve">además contará con un servidor web que aloja </w:t>
+      </w:r>
+      <w:r>
+        <w:rPr>
+          <w:rFonts w:ascii="Arial" w:hAnsi="Arial" w:cs="Arial"/>
+          <w:color w:val="000000" w:themeColor="text1"/>
+        </w:rPr>
+        <w:t xml:space="preserve">una </w:t>
+      </w:r>
+      <w:r>
+        <w:rPr>
+          <w:rFonts w:ascii="Arial" w:hAnsi="Arial" w:cs="Arial"/>
+          <w:color w:val="000000" w:themeColor="text1"/>
+        </w:rPr>
+        <w:t>página</w:t>
+      </w:r>
+      <w:r>
+        <w:rPr>
+          <w:rFonts w:ascii="Arial" w:hAnsi="Arial" w:cs="Arial"/>
+          <w:color w:val="000000" w:themeColor="text1"/>
+        </w:rPr>
+        <w:t xml:space="preserve"> web sencilla para los socios y además contar</w:t>
+      </w:r>
+      <w:r>
+        <w:rPr>
+          <w:rFonts w:ascii="Arial" w:hAnsi="Arial" w:cs="Arial"/>
+          <w:color w:val="000000" w:themeColor="text1"/>
+        </w:rPr>
+        <w:t>á</w:t>
+      </w:r>
+      <w:r>
+        <w:rPr>
+          <w:rFonts w:ascii="Arial" w:hAnsi="Arial" w:cs="Arial"/>
+          <w:color w:val="000000" w:themeColor="text1"/>
+        </w:rPr>
+        <w:t xml:space="preserve"> un apartado de videos exclusivo para dichos socios. Para gestionar a todos los usuarios</w:t>
+      </w:r>
+      <w:r>
+        <w:rPr>
+          <w:rFonts w:ascii="Arial" w:hAnsi="Arial" w:cs="Arial"/>
+          <w:color w:val="000000" w:themeColor="text1"/>
+        </w:rPr>
+        <w:t xml:space="preserve"> y permisos</w:t>
+      </w:r>
+      <w:r>
+        <w:rPr>
+          <w:rFonts w:ascii="Arial" w:hAnsi="Arial" w:cs="Arial"/>
+          <w:color w:val="000000" w:themeColor="text1"/>
+        </w:rPr>
+        <w:t xml:space="preserve"> se va a utilizar Active Directory</w:t>
+      </w:r>
+      <w:r>
+        <w:rPr>
+          <w:rFonts w:ascii="Arial" w:hAnsi="Arial" w:cs="Arial"/>
+          <w:color w:val="000000" w:themeColor="text1"/>
+        </w:rPr>
+        <w:t xml:space="preserve"> y para la web se va a utilizar WordPress con una plantilla.</w:t>
+      </w:r>
+    </w:p>
+    <w:p>
+      <w:pPr>
+        <w:spacing w:line="360" w:lineRule="auto"/>
+        <w:jc w:val="both"/>
+        <w:rPr>
+          <w:rFonts w:ascii="Arial" w:hAnsi="Arial" w:cs="Arial"/>
+          <w:color w:val="000000" w:themeColor="text1"/>
+        </w:rPr>
+      </w:pPr>
+    </w:p>
+    <w:p>
+      <w:pPr>
+        <w:spacing w:line="360" w:lineRule="auto"/>
+        <w:jc w:val="both"/>
+        <w:rPr>
+          <w:rFonts w:ascii="Arial" w:hAnsi="Arial" w:cs="Arial"/>
+          <w:color w:val="000000" w:themeColor="text1"/>
+        </w:rPr>
+      </w:pPr>
+      <w:r>
+        <w:rPr>
+          <w:rFonts w:ascii="Arial" w:hAnsi="Arial" w:cs="Arial"/>
+          <w:color w:val="000000" w:themeColor="text1"/>
+        </w:rPr>
+        <w:t>Inglés</w:t>
+      </w:r>
+    </w:p>
+    <w:p>
+      <w:pPr>
+        <w:spacing w:line="360" w:lineRule="auto"/>
+        <w:jc w:val="both"/>
+        <w:rPr>
+          <w:rFonts w:ascii="Arial" w:hAnsi="Arial" w:cs="Arial"/>
+          <w:color w:val="000000" w:themeColor="text1"/>
+          <w:lang w:val="en"/>
+        </w:rPr>
+      </w:pPr>
+      <w:r>
+        <w:rPr>
+          <w:rFonts w:ascii="Arial" w:hAnsi="Arial" w:cs="Arial"/>
+          <w:color w:val="000000" w:themeColor="text1"/>
+          <w:lang w:val="en"/>
+        </w:rPr>
+        <w:t>This project involves the design and configuration of an internal network for a football team, divided into three departments. It will also include a web server hosting a simple website for members and a dedicated video section for members only. Active Directory will be used to manage all users and permissions, and the website will be built using WordPress with a custom template.</w:t>
+      </w:r>
+    </w:p>
+    <w:p>
+      <w:pPr>
+        <w:spacing w:line="360" w:lineRule="auto"/>
+        <w:jc w:val="both"/>
+        <w:rPr>
+          <w:rFonts w:ascii="Arial" w:hAnsi="Arial" w:cs="Arial"/>
+          <w:color w:val="000000" w:themeColor="text1"/>
+        </w:rPr>
+      </w:pPr>
     </w:p>
     <w:p>
       <w:pPr>
@@ -395,116 +1048,89 @@
         <w:rPr>
           <w:rFonts w:ascii="Arial" w:hAnsi="Arial" w:cs="Arial"/>
           <w:color w:val="000000" w:themeColor="text1"/>
+        </w:rPr>
+        <w:t xml:space="preserve"> </w:t>
+      </w:r>
+      <w:r>
+        <w:rPr>
+          <w:rFonts w:ascii="Arial" w:hAnsi="Arial" w:cs="Arial"/>
+          <w:color w:val="000000" w:themeColor="text1"/>
           <w:sz w:val="32"/>
           <w:szCs w:val="32"/>
         </w:rPr>
-        <w:lastRenderedPageBreak/>
-        <w:t>ABSTRACT</w:t>
-      </w:r>
-      <w:r>
-        <w:tab/>
-      </w:r>
-    </w:p>
-    <w:p>
-      <w:pPr>
-        <w:spacing w:line="360" w:lineRule="auto"/>
-        <w:jc w:val="both"/>
-        <w:rPr>
-          <w:rFonts w:ascii="Arial" w:hAnsi="Arial" w:cs="Arial"/>
-          <w:color w:val="000000" w:themeColor="text1"/>
-        </w:rPr>
-      </w:pPr>
-      <w:r>
-        <w:rPr>
-          <w:rFonts w:ascii="Arial" w:hAnsi="Arial" w:cs="Arial"/>
-          <w:color w:val="000000" w:themeColor="text1"/>
-        </w:rPr>
-        <w:t>U</w:t>
-      </w:r>
-      <w:r>
-        <w:rPr>
-          <w:rFonts w:ascii="Arial" w:hAnsi="Arial" w:cs="Arial"/>
-          <w:color w:val="000000" w:themeColor="text1"/>
-        </w:rPr>
-        <w:t xml:space="preserve">n pequeño resumen </w:t>
-      </w:r>
-      <w:r>
-        <w:rPr>
-          <w:rFonts w:ascii="Arial" w:hAnsi="Arial" w:cs="Arial"/>
-          <w:color w:val="000000" w:themeColor="text1"/>
-        </w:rPr>
-        <w:t>del pr</w:t>
-      </w:r>
-      <w:r>
-        <w:rPr>
-          <w:rFonts w:ascii="Arial" w:hAnsi="Arial" w:cs="Arial"/>
-          <w:color w:val="000000" w:themeColor="text1"/>
-        </w:rPr>
-        <w:t>o</w:t>
-      </w:r>
-      <w:r>
-        <w:rPr>
-          <w:rFonts w:ascii="Arial" w:hAnsi="Arial" w:cs="Arial"/>
-          <w:color w:val="000000" w:themeColor="text1"/>
-        </w:rPr>
-        <w:t xml:space="preserve">yecto </w:t>
-      </w:r>
-      <w:r>
-        <w:rPr>
-          <w:rFonts w:ascii="Arial" w:hAnsi="Arial" w:cs="Arial"/>
-          <w:color w:val="000000" w:themeColor="text1"/>
-        </w:rPr>
-        <w:t>en español y en inglés.</w:t>
-      </w:r>
-      <w:r>
-        <w:rPr>
-          <w:rFonts w:ascii="Arial" w:hAnsi="Arial" w:cs="Arial"/>
-          <w:color w:val="000000" w:themeColor="text1"/>
-        </w:rPr>
-        <w:t xml:space="preserve"> Ocupa 1 página.</w:t>
-      </w:r>
-    </w:p>
-    <w:p>
-      <w:pPr>
-        <w:rPr>
-          <w:color w:val="000000" w:themeColor="text1"/>
-        </w:rPr>
-      </w:pPr>
-      <w:r>
-        <w:rPr>
-          <w:color w:val="000000" w:themeColor="text1"/>
-        </w:rPr>
-        <w:br w:type="page"/>
-      </w:r>
-    </w:p>
-    <w:p>
-      <w:pPr>
-        <w:spacing w:line="360" w:lineRule="auto"/>
-        <w:jc w:val="both"/>
+        <w:t>JUSTIFICACIÓ</w:t>
+      </w:r>
+      <w:r>
         <w:rPr>
           <w:rFonts w:ascii="Arial" w:hAnsi="Arial" w:cs="Arial"/>
           <w:color w:val="000000" w:themeColor="text1"/>
           <w:sz w:val="32"/>
           <w:szCs w:val="32"/>
         </w:rPr>
-      </w:pPr>
-      <w:r>
-        <w:rPr>
-          <w:rFonts w:ascii="Arial" w:hAnsi="Arial" w:cs="Arial"/>
-          <w:color w:val="000000" w:themeColor="text1"/>
-        </w:rPr>
-        <w:lastRenderedPageBreak/>
-        <w:t xml:space="preserve"> </w:t>
-      </w:r>
-      <w:r>
+        <w:t>N DEL PROYECTO</w:t>
+      </w:r>
+    </w:p>
+    <w:p>
+      <w:pPr>
+        <w:rPr>
+          <w:rFonts w:ascii="Arial" w:hAnsi="Arial" w:cs="Arial"/>
+          <w:color w:val="000000" w:themeColor="text1"/>
+        </w:rPr>
+      </w:pPr>
+      <w:r>
+        <w:rPr>
+          <w:rFonts w:ascii="Arial" w:hAnsi="Arial" w:cs="Arial"/>
+          <w:color w:val="000000" w:themeColor="text1"/>
+        </w:rPr>
+        <w:t>Este proyecto va a tener una estructura encabezada por el servicio de Active Directory para llevar toda la gestión de usuarios y permisos. Dichos usuarios se dividirán en tres directivas independientes entre sí. Esas directivas también se verán reflejada en una red interna en forma de 3 redes distintas y aisladas, aunque solo una de ellas se comunicara con las otras dos.</w:t>
+      </w:r>
+    </w:p>
+    <w:p>
+      <w:pPr>
+        <w:rPr>
+          <w:rFonts w:ascii="Arial" w:hAnsi="Arial" w:cs="Arial"/>
+          <w:color w:val="000000" w:themeColor="text1"/>
+        </w:rPr>
+      </w:pPr>
+      <w:r>
+        <w:rPr>
+          <w:rFonts w:ascii="Arial" w:hAnsi="Arial" w:cs="Arial"/>
+          <w:color w:val="000000" w:themeColor="text1"/>
+        </w:rPr>
+        <w:t>Como conceptos, habrá una máquina virtual que hará de servidor principal y dentro de ella se creará el servidor DNS, el servicio de Active Directory e IIS. También habrá una página web que estará conectada al Active Directory mediante el IIS. Para ver la disposición de todos estos elementos, habrá un esquema de toda la red.</w:t>
+      </w:r>
+    </w:p>
+    <w:p>
+      <w:pPr>
+        <w:rPr>
+          <w:color w:val="000000" w:themeColor="text1"/>
+        </w:rPr>
+      </w:pPr>
+      <w:r>
+        <w:rPr>
+          <w:rFonts w:ascii="Arial" w:hAnsi="Arial" w:cs="Arial"/>
+          <w:color w:val="000000" w:themeColor="text1"/>
+        </w:rPr>
+        <w:t>El tema elegido es un equipo de futbol ya que es algo que me gusta y también es algo bastante actual y es un tema que puede estar bien para un proyecto como este.</w:t>
+      </w:r>
+      <w:r>
+        <w:rPr>
+          <w:color w:val="000000" w:themeColor="text1"/>
+        </w:rPr>
+        <w:br w:type="page"/>
+      </w:r>
+    </w:p>
+    <w:p>
+      <w:pPr>
+        <w:spacing w:line="360" w:lineRule="auto"/>
+        <w:jc w:val="both"/>
         <w:rPr>
           <w:rFonts w:ascii="Arial" w:hAnsi="Arial" w:cs="Arial"/>
           <w:color w:val="000000" w:themeColor="text1"/>
           <w:sz w:val="32"/>
           <w:szCs w:val="32"/>
         </w:rPr>
-        <w:t>JUSTIFICACIÓ</w:t>
-      </w:r>
+      </w:pPr>
       <w:r>
         <w:rPr>
           <w:rFonts w:ascii="Arial" w:hAnsi="Arial" w:cs="Arial"/>
@@ -512,118 +1138,16 @@
           <w:sz w:val="32"/>
           <w:szCs w:val="32"/>
         </w:rPr>
-        <w:t>N DEL PROYECTO</w:t>
-      </w:r>
-    </w:p>
-    <w:p>
-      <w:pPr>
-        <w:spacing w:line="360" w:lineRule="auto"/>
-        <w:jc w:val="both"/>
-        <w:rPr>
-          <w:rFonts w:ascii="Arial" w:hAnsi="Arial" w:cs="Arial"/>
-          <w:color w:val="000000" w:themeColor="text1"/>
-        </w:rPr>
-      </w:pPr>
-      <w:r>
-        <w:rPr>
-          <w:rFonts w:ascii="Arial" w:hAnsi="Arial" w:cs="Arial"/>
-          <w:color w:val="000000" w:themeColor="text1"/>
-        </w:rPr>
-        <w:t xml:space="preserve">La motivación principal que impulsa la creación de </w:t>
-      </w:r>
-      <w:r>
-        <w:rPr>
-          <w:rFonts w:ascii="Arial" w:hAnsi="Arial" w:cs="Arial"/>
-          <w:color w:val="000000" w:themeColor="text1"/>
-        </w:rPr>
-        <w:t>est</w:t>
-      </w:r>
-      <w:r>
-        <w:rPr>
-          <w:rFonts w:ascii="Arial" w:hAnsi="Arial" w:cs="Arial"/>
-          <w:color w:val="000000" w:themeColor="text1"/>
-        </w:rPr>
-        <w:t>e proyecto</w:t>
-      </w:r>
-      <w:r>
-        <w:rPr>
-          <w:rFonts w:ascii="Arial" w:hAnsi="Arial" w:cs="Arial"/>
-          <w:color w:val="000000" w:themeColor="text1"/>
-        </w:rPr>
-        <w:t>.</w:t>
-      </w:r>
-      <w:r>
-        <w:br/>
-      </w:r>
-      <w:r>
-        <w:rPr>
-          <w:rFonts w:ascii="Arial" w:hAnsi="Arial" w:cs="Arial"/>
-          <w:color w:val="000000" w:themeColor="text1"/>
-        </w:rPr>
-        <w:t>Estado de la cuestión, si hay aplicaciones similares, público al que va dirigido...</w:t>
-      </w:r>
-      <w:r>
-        <w:br/>
-      </w:r>
-      <w:r>
-        <w:rPr>
-          <w:rFonts w:ascii="Arial" w:hAnsi="Arial" w:cs="Arial"/>
-          <w:color w:val="000000" w:themeColor="text1"/>
-        </w:rPr>
-        <w:t>Se espera una comparativa razonada.</w:t>
-      </w:r>
-    </w:p>
-    <w:p>
-      <w:pPr>
-        <w:spacing w:line="360" w:lineRule="auto"/>
-        <w:jc w:val="both"/>
-        <w:rPr>
-          <w:rFonts w:ascii="Arial" w:hAnsi="Arial" w:cs="Arial"/>
-          <w:color w:val="000000" w:themeColor="text1"/>
-        </w:rPr>
-      </w:pPr>
-    </w:p>
-    <w:p>
-      <w:pPr>
-        <w:rPr>
-          <w:color w:val="000000" w:themeColor="text1"/>
-        </w:rPr>
-      </w:pPr>
-      <w:r>
-        <w:rPr>
-          <w:color w:val="000000" w:themeColor="text1"/>
-        </w:rPr>
-        <w:br w:type="page"/>
-      </w:r>
-    </w:p>
-    <w:p>
-      <w:pPr>
-        <w:spacing w:line="360" w:lineRule="auto"/>
-        <w:jc w:val="both"/>
+        <w:lastRenderedPageBreak/>
+        <w:t>INTRODUCCIÓ</w:t>
+      </w:r>
+      <w:r>
         <w:rPr>
           <w:rFonts w:ascii="Arial" w:hAnsi="Arial" w:cs="Arial"/>
           <w:color w:val="000000" w:themeColor="text1"/>
           <w:sz w:val="32"/>
           <w:szCs w:val="32"/>
         </w:rPr>
-      </w:pPr>
-      <w:r>
-        <w:rPr>
-          <w:rFonts w:ascii="Arial" w:hAnsi="Arial" w:cs="Arial"/>
-          <w:color w:val="000000" w:themeColor="text1"/>
-          <w:sz w:val="32"/>
-          <w:szCs w:val="32"/>
-        </w:rPr>
-        <w:lastRenderedPageBreak/>
-        <w:t>INTRODUCCIÓ</w:t>
-      </w:r>
-      <w:r>
-        <w:rPr>
-          <w:rFonts w:ascii="Arial" w:hAnsi="Arial" w:cs="Arial"/>
-          <w:color w:val="000000" w:themeColor="text1"/>
-          <w:sz w:val="32"/>
-          <w:szCs w:val="32"/>
-        </w:rPr>
         <w:t>N</w:t>
       </w:r>
     </w:p>
@@ -632,32 +1156,93 @@
         <w:spacing w:line="360" w:lineRule="auto"/>
         <w:jc w:val="both"/>
         <w:rPr>
-          <w:color w:val="000000" w:themeColor="text1"/>
-        </w:rPr>
-      </w:pPr>
-      <w:r>
-        <w:rPr>
-          <w:rFonts w:ascii="Arial" w:hAnsi="Arial" w:cs="Arial"/>
-          <w:color w:val="000000" w:themeColor="text1"/>
-        </w:rPr>
-        <w:t>Principales funciones y problemas que resuelve.</w:t>
-      </w:r>
-      <w:r>
-        <w:br/>
-      </w:r>
-      <w:r>
-        <w:rPr>
-          <w:rFonts w:ascii="Arial" w:hAnsi="Arial" w:cs="Arial"/>
-          <w:color w:val="000000" w:themeColor="text1"/>
-        </w:rPr>
-        <w:t>Puedes listar los principales requisitos que debe cumplir tu proyecto.</w:t>
-      </w:r>
-      <w:r>
-        <w:rPr>
-          <w:rFonts w:ascii="Arial" w:hAnsi="Arial" w:cs="Arial"/>
-          <w:color w:val="000000" w:themeColor="text1"/>
-        </w:rPr>
-        <w:t xml:space="preserve"> </w:t>
+          <w:rFonts w:ascii="Arial" w:hAnsi="Arial" w:cs="Arial"/>
+          <w:color w:val="000000" w:themeColor="text1"/>
+        </w:rPr>
+      </w:pPr>
+      <w:r>
+        <w:rPr>
+          <w:rFonts w:ascii="Arial" w:hAnsi="Arial" w:cs="Arial"/>
+          <w:color w:val="000000" w:themeColor="text1"/>
+        </w:rPr>
+        <w:t>La función principal de este proyecto es ofrecer al aficionado una pagina web sencilla pero segura para conocer mejor su club. En la pagina contara con una zona exclusiva solamente socios en la que podrán ver videos resumen de partidos anteriores e incluso podrá subir a un</w:t>
+      </w:r>
+      <w:r>
+        <w:rPr>
+          <w:rFonts w:ascii="Arial" w:hAnsi="Arial" w:cs="Arial"/>
+          <w:color w:val="000000" w:themeColor="text1"/>
+        </w:rPr>
+        <w:t xml:space="preserve"> servidor sus propios videos para compartirlos con otros socios. Para garantizar la exclusividad, para acceder habrá que introducir un usuario y contraseña. En esta </w:t>
+      </w:r>
+      <w:proofErr w:type="spellStart"/>
+      <w:r>
+        <w:rPr>
+          <w:rFonts w:ascii="Arial" w:hAnsi="Arial" w:cs="Arial"/>
+          <w:color w:val="000000" w:themeColor="text1"/>
+        </w:rPr>
+        <w:t>pagina</w:t>
+      </w:r>
+      <w:proofErr w:type="spellEnd"/>
+      <w:r>
+        <w:rPr>
+          <w:rFonts w:ascii="Arial" w:hAnsi="Arial" w:cs="Arial"/>
+          <w:color w:val="000000" w:themeColor="text1"/>
+        </w:rPr>
+        <w:t xml:space="preserve"> también habrá una zona de administración que también habrá que acceder mediante usuario y contraseña. En este caso será para que los administradores puedan gestionar la </w:t>
+      </w:r>
+      <w:proofErr w:type="spellStart"/>
+      <w:r>
+        <w:rPr>
+          <w:rFonts w:ascii="Arial" w:hAnsi="Arial" w:cs="Arial"/>
+          <w:color w:val="000000" w:themeColor="text1"/>
+        </w:rPr>
+        <w:t>pagina</w:t>
+      </w:r>
+      <w:proofErr w:type="spellEnd"/>
+      <w:r>
+        <w:rPr>
+          <w:rFonts w:ascii="Arial" w:hAnsi="Arial" w:cs="Arial"/>
+          <w:color w:val="000000" w:themeColor="text1"/>
+        </w:rPr>
+        <w:t xml:space="preserve"> desde ahí.</w:t>
+      </w:r>
+    </w:p>
+    <w:p>
+      <w:pPr>
+        <w:spacing w:line="360" w:lineRule="auto"/>
+        <w:jc w:val="both"/>
+        <w:rPr>
+          <w:rFonts w:ascii="Arial" w:hAnsi="Arial" w:cs="Arial"/>
+          <w:color w:val="000000" w:themeColor="text1"/>
+        </w:rPr>
+      </w:pPr>
+      <w:r>
+        <w:rPr>
+          <w:rFonts w:ascii="Arial" w:hAnsi="Arial" w:cs="Arial"/>
+          <w:color w:val="000000" w:themeColor="text1"/>
+        </w:rPr>
+        <w:t xml:space="preserve">Para poder garantizar estas medidas se </w:t>
+      </w:r>
+      <w:r>
+        <w:rPr>
+          <w:rFonts w:ascii="Arial" w:hAnsi="Arial" w:cs="Arial"/>
+          <w:color w:val="000000" w:themeColor="text1"/>
+        </w:rPr>
+        <w:t>aplicarán</w:t>
+      </w:r>
+      <w:r>
+        <w:rPr>
+          <w:rFonts w:ascii="Arial" w:hAnsi="Arial" w:cs="Arial"/>
+          <w:color w:val="000000" w:themeColor="text1"/>
+        </w:rPr>
+        <w:t xml:space="preserve"> directivas en servicio de Active Directory</w:t>
+      </w:r>
+      <w:r>
+        <w:rPr>
+          <w:rFonts w:ascii="Arial" w:hAnsi="Arial" w:cs="Arial"/>
+          <w:color w:val="000000" w:themeColor="text1"/>
+        </w:rPr>
+        <w:t xml:space="preserve"> a los usuarios a través de directivas de grupo.</w:t>
       </w:r>
       <w:r>
         <w:rPr>
@@ -3182,7 +3767,7 @@
           <w:lang w:eastAsia="es-ES"/>
         </w:rPr>
         <w:drawing>
-          <wp:inline distT="0" distB="0" distL="0" distR="0" wp14:anchorId="2553B363" wp14:editId="5CB39818">
+          <wp:inline distT="0" distB="0" distL="0" distR="0" wp14:anchorId="2553B363" wp14:editId="7DC5688F">
             <wp:extent cx="2762907" cy="2003108"/>
             <wp:effectExtent l="0" t="0" r="0" b="0"/>
             <wp:docPr id="1095691568" name="Imagen 1095691568"/>
@@ -3822,6 +4407,7 @@
           <w:szCs w:val="24"/>
         </w:rPr>
       </w:pPr>
+      <w:bookmarkStart w:id="0" w:name="_Toc223685188"/>
       <w:r>
         <w:rPr>
           <w:rFonts w:ascii="Arial" w:hAnsi="Arial" w:cs="Arial"/>
@@ -3879,9 +4465,18 @@
         </w:rPr>
         <w:t xml:space="preserve"> VirtualBox</w:t>
       </w:r>
-    </w:p>
-    <w:p>
-      <w:r>
+      <w:bookmarkEnd w:id="0"/>
+    </w:p>
+    <w:p>
+      <w:pPr>
+        <w:rPr>
+          <w:rFonts w:ascii="Arial" w:hAnsi="Arial" w:cs="Arial"/>
+        </w:rPr>
+      </w:pPr>
+      <w:r>
+        <w:rPr>
+          <w:rFonts w:ascii="Arial" w:hAnsi="Arial" w:cs="Arial"/>
+        </w:rPr>
         <w:t>He utilizado VirtualBox para crear una máquina virtual donde estará el servidor</w:t>
       </w:r>
     </w:p>
@@ -4000,6 +4595,7 @@
           <w:szCs w:val="24"/>
         </w:rPr>
       </w:pPr>
+      <w:bookmarkStart w:id="1" w:name="_Toc223685189"/>
       <w:r>
         <w:rPr>
           <w:rFonts w:ascii="Arial" w:hAnsi="Arial" w:cs="Arial"/>
@@ -4057,12 +4653,35 @@
         </w:rPr>
         <w:t xml:space="preserve"> WordPress</w:t>
       </w:r>
-    </w:p>
-    <w:p>
-      <w:r>
-        <w:t>He utilizado WordPress para crear la pagina web del club</w:t>
-      </w:r>
-    </w:p>
+      <w:bookmarkEnd w:id="1"/>
+    </w:p>
+    <w:p>
+      <w:pPr>
+        <w:rPr>
+          <w:rFonts w:ascii="Arial" w:hAnsi="Arial" w:cs="Arial"/>
+        </w:rPr>
+      </w:pPr>
+      <w:r>
+        <w:rPr>
+          <w:rFonts w:ascii="Arial" w:hAnsi="Arial" w:cs="Arial"/>
+        </w:rPr>
+        <w:t xml:space="preserve">He utilizado WordPress para crear la </w:t>
+      </w:r>
+      <w:r>
+        <w:rPr>
+          <w:rFonts w:ascii="Arial" w:hAnsi="Arial" w:cs="Arial"/>
+        </w:rPr>
+        <w:t>página</w:t>
+      </w:r>
+      <w:r>
+        <w:rPr>
+          <w:rFonts w:ascii="Arial" w:hAnsi="Arial" w:cs="Arial"/>
+        </w:rPr>
+        <w:t xml:space="preserve"> web del club</w:t>
+      </w:r>
+    </w:p>
+    <w:p/>
+    <w:p/>
     <w:p>
       <w:pPr>
         <w:spacing w:line="360" w:lineRule="auto"/>
@@ -4086,13 +4705,780 @@
           <w:szCs w:val="32"/>
         </w:rPr>
       </w:pPr>
-      <w:r>
+    </w:p>
+    <w:p>
+      <w:pPr>
+        <w:spacing w:line="360" w:lineRule="auto"/>
+        <w:jc w:val="both"/>
         <w:rPr>
           <w:rFonts w:ascii="Arial" w:hAnsi="Arial" w:cs="Arial"/>
           <w:color w:val="000000" w:themeColor="text1"/>
           <w:sz w:val="32"/>
           <w:szCs w:val="32"/>
         </w:rPr>
+      </w:pPr>
+    </w:p>
+    <w:p>
+      <w:pPr>
+        <w:spacing w:line="360" w:lineRule="auto"/>
+        <w:jc w:val="both"/>
+        <w:rPr>
+          <w:rFonts w:ascii="Arial" w:hAnsi="Arial" w:cs="Arial"/>
+          <w:color w:val="000000" w:themeColor="text1"/>
+          <w:sz w:val="32"/>
+          <w:szCs w:val="32"/>
+        </w:rPr>
+      </w:pPr>
+      <w:r>
+        <w:rPr>
+          <w:rFonts w:ascii="Arial" w:hAnsi="Arial" w:cs="Arial"/>
+          <w:noProof/>
+          <w:color w:val="000000" w:themeColor="text1"/>
+          <w:sz w:val="32"/>
+          <w:szCs w:val="32"/>
+        </w:rPr>
+        <w:lastRenderedPageBreak/>
+        <w:drawing>
+          <wp:anchor distT="0" distB="0" distL="114300" distR="114300" simplePos="0" relativeHeight="251660288" behindDoc="0" locked="0" layoutInCell="1" allowOverlap="1" wp14:anchorId="6963D6B2" wp14:editId="73DF3DC1">
+            <wp:simplePos x="914400" y="1854200"/>
+            <wp:positionH relativeFrom="margin">
+              <wp:align>center</wp:align>
+            </wp:positionH>
+            <wp:positionV relativeFrom="margin">
+              <wp:align>top</wp:align>
+            </wp:positionV>
+            <wp:extent cx="3422650" cy="2012950"/>
+            <wp:effectExtent l="0" t="0" r="6350" b="6350"/>
+            <wp:wrapSquare wrapText="bothSides"/>
+            <wp:docPr id="4" name="Imagen 4" descr="Logotipo, nombre de la empresa&#10;&#10;El contenido generado por IA puede ser incorrecto."/>
+            <wp:cNvGraphicFramePr>
+              <a:graphicFrameLocks xmlns:a="http://schemas.openxmlformats.org/drawingml/2006/main" noChangeAspect="1"/>
+            </wp:cNvGraphicFramePr>
+            <a:graphic xmlns:a="http://schemas.openxmlformats.org/drawingml/2006/main">
+              <a:graphicData uri="http://schemas.openxmlformats.org/drawingml/2006/picture">
+                <pic:pic xmlns:pic="http://schemas.openxmlformats.org/drawingml/2006/picture">
+                  <pic:nvPicPr>
+                    <pic:cNvPr id="4" name="Imagen 4" descr="Logotipo, nombre de la empresa&#10;&#10;El contenido generado por IA puede ser incorrecto."/>
+                    <pic:cNvPicPr/>
+                  </pic:nvPicPr>
+                  <pic:blipFill rotWithShape="1">
+                    <a:blip r:embed="rId22">
+                      <a:extLst>
+                        <a:ext uri="{28A0092B-C50C-407E-A947-70E740481C1C}">
+                          <a14:useLocalDpi xmlns:a14="http://schemas.microsoft.com/office/drawing/2010/main" val="0"/>
+                        </a:ext>
+                      </a:extLst>
+                    </a:blip>
+                    <a:srcRect t="16987" r="-323" b="24010"/>
+                    <a:stretch/>
+                  </pic:blipFill>
+                  <pic:spPr bwMode="auto">
+                    <a:xfrm>
+                      <a:off x="0" y="0"/>
+                      <a:ext cx="3422650" cy="2012950"/>
+                    </a:xfrm>
+                    <a:prstGeom prst="rect">
+                      <a:avLst/>
+                    </a:prstGeom>
+                    <a:ln>
+                      <a:noFill/>
+                    </a:ln>
+                    <a:extLst>
+                      <a:ext uri="{53640926-AAD7-44D8-BBD7-CCE9431645EC}">
+                        <a14:shadowObscured xmlns:a14="http://schemas.microsoft.com/office/drawing/2010/main"/>
+                      </a:ext>
+                    </a:extLst>
+                  </pic:spPr>
+                </pic:pic>
+              </a:graphicData>
+            </a:graphic>
+          </wp:anchor>
+        </w:drawing>
+      </w:r>
+    </w:p>
+    <w:p>
+      <w:pPr>
+        <w:spacing w:line="360" w:lineRule="auto"/>
+        <w:jc w:val="both"/>
+        <w:rPr>
+          <w:rFonts w:ascii="Arial" w:hAnsi="Arial" w:cs="Arial"/>
+          <w:color w:val="000000" w:themeColor="text1"/>
+          <w:sz w:val="32"/>
+          <w:szCs w:val="32"/>
+        </w:rPr>
+      </w:pPr>
+    </w:p>
+    <w:p>
+      <w:pPr>
+        <w:spacing w:line="360" w:lineRule="auto"/>
+        <w:jc w:val="both"/>
+        <w:rPr>
+          <w:rFonts w:ascii="Arial" w:hAnsi="Arial" w:cs="Arial"/>
+          <w:color w:val="000000" w:themeColor="text1"/>
+          <w:sz w:val="32"/>
+          <w:szCs w:val="32"/>
+        </w:rPr>
+      </w:pPr>
+    </w:p>
+    <w:p>
+      <w:pPr>
+        <w:spacing w:line="360" w:lineRule="auto"/>
+        <w:jc w:val="both"/>
+        <w:rPr>
+          <w:rFonts w:ascii="Arial" w:hAnsi="Arial" w:cs="Arial"/>
+          <w:color w:val="000000" w:themeColor="text1"/>
+          <w:sz w:val="32"/>
+          <w:szCs w:val="32"/>
+        </w:rPr>
+      </w:pPr>
+    </w:p>
+    <w:p>
+      <w:pPr>
+        <w:spacing w:line="360" w:lineRule="auto"/>
+        <w:jc w:val="both"/>
+        <w:rPr>
+          <w:rFonts w:ascii="Arial" w:hAnsi="Arial" w:cs="Arial"/>
+          <w:color w:val="000000" w:themeColor="text1"/>
+          <w:sz w:val="24"/>
+          <w:szCs w:val="24"/>
+        </w:rPr>
+      </w:pPr>
+      <w:r>
+        <w:rPr>
+          <w:rFonts w:ascii="Arial" w:hAnsi="Arial" w:cs="Arial"/>
+          <w:color w:val="000000" w:themeColor="text1"/>
+          <w:sz w:val="32"/>
+          <w:szCs w:val="32"/>
+        </w:rPr>
+        <w:t xml:space="preserve"> </w:t>
+      </w:r>
+    </w:p>
+    <w:p>
+      <w:pPr>
+        <w:pStyle w:val="Descripcin"/>
+        <w:jc w:val="center"/>
+        <w:rPr>
+          <w:rFonts w:ascii="Arial" w:hAnsi="Arial" w:cs="Arial"/>
+          <w:sz w:val="24"/>
+          <w:szCs w:val="24"/>
+        </w:rPr>
+      </w:pPr>
+      <w:bookmarkStart w:id="2" w:name="_Toc223685190"/>
+      <w:r>
+        <w:rPr>
+          <w:rFonts w:ascii="Arial" w:hAnsi="Arial" w:cs="Arial"/>
+          <w:sz w:val="24"/>
+          <w:szCs w:val="24"/>
+        </w:rPr>
+        <w:t xml:space="preserve">Ilustración </w:t>
+      </w:r>
+      <w:r>
+        <w:rPr>
+          <w:rFonts w:ascii="Arial" w:hAnsi="Arial" w:cs="Arial"/>
+          <w:sz w:val="24"/>
+          <w:szCs w:val="24"/>
+        </w:rPr>
+        <w:fldChar w:fldCharType="begin"/>
+      </w:r>
+      <w:r>
+        <w:rPr>
+          <w:rFonts w:ascii="Arial" w:hAnsi="Arial" w:cs="Arial"/>
+          <w:sz w:val="24"/>
+          <w:szCs w:val="24"/>
+        </w:rPr>
+        <w:instrText xml:space="preserve"> SEQ Ilustración \* ARABIC </w:instrText>
+      </w:r>
+      <w:r>
+        <w:rPr>
+          <w:rFonts w:ascii="Arial" w:hAnsi="Arial" w:cs="Arial"/>
+          <w:sz w:val="24"/>
+          <w:szCs w:val="24"/>
+        </w:rPr>
+        <w:fldChar w:fldCharType="separate"/>
+      </w:r>
+      <w:r>
+        <w:rPr>
+          <w:rFonts w:ascii="Arial" w:hAnsi="Arial" w:cs="Arial"/>
+          <w:noProof/>
+          <w:sz w:val="24"/>
+          <w:szCs w:val="24"/>
+        </w:rPr>
+        <w:t>3</w:t>
+      </w:r>
+      <w:r>
+        <w:rPr>
+          <w:rFonts w:ascii="Arial" w:hAnsi="Arial" w:cs="Arial"/>
+          <w:sz w:val="24"/>
+          <w:szCs w:val="24"/>
+        </w:rPr>
+        <w:fldChar w:fldCharType="end"/>
+      </w:r>
+      <w:r>
+        <w:rPr>
+          <w:rFonts w:ascii="Arial" w:hAnsi="Arial" w:cs="Arial"/>
+          <w:sz w:val="24"/>
+          <w:szCs w:val="24"/>
+        </w:rPr>
+        <w:t xml:space="preserve"> Active Directory</w:t>
+      </w:r>
+      <w:bookmarkEnd w:id="2"/>
+    </w:p>
+    <w:p>
+      <w:pPr>
+        <w:rPr>
+          <w:rFonts w:ascii="Arial" w:hAnsi="Arial" w:cs="Arial"/>
+        </w:rPr>
+      </w:pPr>
+      <w:r>
+        <w:rPr>
+          <w:rFonts w:ascii="Arial" w:hAnsi="Arial" w:cs="Arial"/>
+        </w:rPr>
+        <w:t>He utilizado Active Directory para llevar toda la gestión de los usuarios</w:t>
+      </w:r>
+    </w:p>
+    <w:p>
+      <w:pPr>
+        <w:rPr>
+          <w:rFonts w:ascii="Arial" w:hAnsi="Arial" w:cs="Arial"/>
+        </w:rPr>
+      </w:pPr>
+    </w:p>
+    <w:p>
+      <w:pPr>
+        <w:rPr>
+          <w:rFonts w:ascii="Arial" w:hAnsi="Arial" w:cs="Arial"/>
+        </w:rPr>
+      </w:pPr>
+      <w:r>
+        <w:rPr>
+          <w:rFonts w:ascii="Arial" w:hAnsi="Arial" w:cs="Arial"/>
+          <w:noProof/>
+        </w:rPr>
+        <w:drawing>
+          <wp:anchor distT="0" distB="0" distL="114300" distR="114300" simplePos="0" relativeHeight="251661312" behindDoc="0" locked="0" layoutInCell="1" allowOverlap="1" wp14:anchorId="133A7B8B" wp14:editId="159D4B53">
+            <wp:simplePos x="914400" y="4876800"/>
+            <wp:positionH relativeFrom="margin">
+              <wp:align>center</wp:align>
+            </wp:positionH>
+            <wp:positionV relativeFrom="margin">
+              <wp:align>center</wp:align>
+            </wp:positionV>
+            <wp:extent cx="1547948" cy="1447800"/>
+            <wp:effectExtent l="0" t="0" r="0" b="0"/>
+            <wp:wrapSquare wrapText="bothSides"/>
+            <wp:docPr id="5" name="Imagen 5" descr="Icono&#10;&#10;El contenido generado por IA puede ser incorrecto."/>
+            <wp:cNvGraphicFramePr>
+              <a:graphicFrameLocks xmlns:a="http://schemas.openxmlformats.org/drawingml/2006/main" noChangeAspect="1"/>
+            </wp:cNvGraphicFramePr>
+            <a:graphic xmlns:a="http://schemas.openxmlformats.org/drawingml/2006/main">
+              <a:graphicData uri="http://schemas.openxmlformats.org/drawingml/2006/picture">
+                <pic:pic xmlns:pic="http://schemas.openxmlformats.org/drawingml/2006/picture">
+                  <pic:nvPicPr>
+                    <pic:cNvPr id="5" name="Imagen 5" descr="Icono&#10;&#10;El contenido generado por IA puede ser incorrecto."/>
+                    <pic:cNvPicPr/>
+                  </pic:nvPicPr>
+                  <pic:blipFill rotWithShape="1">
+                    <a:blip r:embed="rId23" cstate="print">
+                      <a:extLst>
+                        <a:ext uri="{28A0092B-C50C-407E-A947-70E740481C1C}">
+                          <a14:useLocalDpi xmlns:a14="http://schemas.microsoft.com/office/drawing/2010/main" val="0"/>
+                        </a:ext>
+                      </a:extLst>
+                    </a:blip>
+                    <a:srcRect l="3642" t="6765" r="3863" b="6726"/>
+                    <a:stretch/>
+                  </pic:blipFill>
+                  <pic:spPr bwMode="auto">
+                    <a:xfrm>
+                      <a:off x="0" y="0"/>
+                      <a:ext cx="1547948" cy="1447800"/>
+                    </a:xfrm>
+                    <a:prstGeom prst="rect">
+                      <a:avLst/>
+                    </a:prstGeom>
+                    <a:ln>
+                      <a:noFill/>
+                    </a:ln>
+                    <a:extLst>
+                      <a:ext uri="{53640926-AAD7-44D8-BBD7-CCE9431645EC}">
+                        <a14:shadowObscured xmlns:a14="http://schemas.microsoft.com/office/drawing/2010/main"/>
+                      </a:ext>
+                    </a:extLst>
+                  </pic:spPr>
+                </pic:pic>
+              </a:graphicData>
+            </a:graphic>
+          </wp:anchor>
+        </w:drawing>
+      </w:r>
+    </w:p>
+    <w:p>
+      <w:pPr>
+        <w:spacing w:line="360" w:lineRule="auto"/>
+        <w:jc w:val="both"/>
+        <w:rPr>
+          <w:rFonts w:ascii="Arial" w:hAnsi="Arial" w:cs="Arial"/>
+          <w:color w:val="000000" w:themeColor="text1"/>
+          <w:sz w:val="32"/>
+          <w:szCs w:val="32"/>
+        </w:rPr>
+      </w:pPr>
+    </w:p>
+    <w:p>
+      <w:pPr>
+        <w:spacing w:line="360" w:lineRule="auto"/>
+        <w:jc w:val="both"/>
+        <w:rPr>
+          <w:rFonts w:ascii="Arial" w:hAnsi="Arial" w:cs="Arial"/>
+          <w:color w:val="000000" w:themeColor="text1"/>
+          <w:sz w:val="32"/>
+          <w:szCs w:val="32"/>
+        </w:rPr>
+      </w:pPr>
+    </w:p>
+    <w:p>
+      <w:pPr>
+        <w:spacing w:line="360" w:lineRule="auto"/>
+        <w:jc w:val="both"/>
+        <w:rPr>
+          <w:rFonts w:ascii="Arial" w:hAnsi="Arial" w:cs="Arial"/>
+          <w:color w:val="000000" w:themeColor="text1"/>
+          <w:sz w:val="32"/>
+          <w:szCs w:val="32"/>
+        </w:rPr>
+      </w:pPr>
+    </w:p>
+    <w:p>
+      <w:pPr>
+        <w:pStyle w:val="Descripcin"/>
+        <w:jc w:val="center"/>
+      </w:pPr>
+    </w:p>
+    <w:p>
+      <w:pPr>
+        <w:pStyle w:val="Descripcin"/>
+        <w:jc w:val="center"/>
+        <w:rPr>
+          <w:rFonts w:ascii="Arial" w:hAnsi="Arial" w:cs="Arial"/>
+          <w:sz w:val="24"/>
+          <w:szCs w:val="24"/>
+        </w:rPr>
+      </w:pPr>
+      <w:bookmarkStart w:id="3" w:name="_Toc223685191"/>
+      <w:r>
+        <w:rPr>
+          <w:rFonts w:ascii="Arial" w:hAnsi="Arial" w:cs="Arial"/>
+          <w:sz w:val="24"/>
+          <w:szCs w:val="24"/>
+        </w:rPr>
+        <w:t xml:space="preserve">Ilustración </w:t>
+      </w:r>
+      <w:r>
+        <w:rPr>
+          <w:rFonts w:ascii="Arial" w:hAnsi="Arial" w:cs="Arial"/>
+          <w:sz w:val="24"/>
+          <w:szCs w:val="24"/>
+        </w:rPr>
+        <w:fldChar w:fldCharType="begin"/>
+      </w:r>
+      <w:r>
+        <w:rPr>
+          <w:rFonts w:ascii="Arial" w:hAnsi="Arial" w:cs="Arial"/>
+          <w:sz w:val="24"/>
+          <w:szCs w:val="24"/>
+        </w:rPr>
+        <w:instrText xml:space="preserve"> SEQ Ilustración \* ARABIC </w:instrText>
+      </w:r>
+      <w:r>
+        <w:rPr>
+          <w:rFonts w:ascii="Arial" w:hAnsi="Arial" w:cs="Arial"/>
+          <w:sz w:val="24"/>
+          <w:szCs w:val="24"/>
+        </w:rPr>
+        <w:fldChar w:fldCharType="separate"/>
+      </w:r>
+      <w:r>
+        <w:rPr>
+          <w:rFonts w:ascii="Arial" w:hAnsi="Arial" w:cs="Arial"/>
+          <w:noProof/>
+          <w:sz w:val="24"/>
+          <w:szCs w:val="24"/>
+        </w:rPr>
+        <w:t>4</w:t>
+      </w:r>
+      <w:r>
+        <w:rPr>
+          <w:rFonts w:ascii="Arial" w:hAnsi="Arial" w:cs="Arial"/>
+          <w:sz w:val="24"/>
+          <w:szCs w:val="24"/>
+        </w:rPr>
+        <w:fldChar w:fldCharType="end"/>
+      </w:r>
+      <w:r>
+        <w:rPr>
+          <w:rFonts w:ascii="Arial" w:hAnsi="Arial" w:cs="Arial"/>
+          <w:sz w:val="24"/>
+          <w:szCs w:val="24"/>
+        </w:rPr>
+        <w:t xml:space="preserve"> Microsoft Proyect</w:t>
+      </w:r>
+      <w:bookmarkEnd w:id="3"/>
+    </w:p>
+    <w:p>
+      <w:pPr>
+        <w:rPr>
+          <w:rFonts w:ascii="Arial" w:hAnsi="Arial" w:cs="Arial"/>
+        </w:rPr>
+      </w:pPr>
+      <w:r>
+        <w:rPr>
+          <w:rFonts w:ascii="Arial" w:hAnsi="Arial" w:cs="Arial"/>
+        </w:rPr>
+        <w:t>He utilizado Microsoft Proyect para realizar el diagrama de Gantt</w:t>
+      </w:r>
+    </w:p>
+    <w:p>
+      <w:pPr>
+        <w:rPr>
+          <w:rFonts w:ascii="Arial" w:hAnsi="Arial" w:cs="Arial"/>
+        </w:rPr>
+      </w:pPr>
+    </w:p>
+    <w:p>
+      <w:pPr>
+        <w:rPr>
+          <w:rFonts w:ascii="Arial" w:hAnsi="Arial" w:cs="Arial"/>
+        </w:rPr>
+      </w:pPr>
+    </w:p>
+    <w:p>
+      <w:pPr>
+        <w:rPr>
+          <w:rFonts w:ascii="Arial" w:hAnsi="Arial" w:cs="Arial"/>
+        </w:rPr>
+      </w:pPr>
+    </w:p>
+    <w:p>
+      <w:pPr>
+        <w:rPr>
+          <w:rFonts w:ascii="Arial" w:hAnsi="Arial" w:cs="Arial"/>
+        </w:rPr>
+      </w:pPr>
+    </w:p>
+    <w:p>
+      <w:pPr>
+        <w:jc w:val="center"/>
+        <w:rPr>
+          <w:rFonts w:ascii="Arial" w:hAnsi="Arial" w:cs="Arial"/>
+        </w:rPr>
+      </w:pPr>
+      <w:r>
+        <w:rPr>
+          <w:rFonts w:ascii="Arial" w:hAnsi="Arial" w:cs="Arial"/>
+          <w:noProof/>
+        </w:rPr>
+        <w:lastRenderedPageBreak/>
+        <w:drawing>
+          <wp:inline distT="0" distB="0" distL="0" distR="0" wp14:anchorId="72C07F7F" wp14:editId="6D59B84A">
+            <wp:extent cx="1653540" cy="1539775"/>
+            <wp:effectExtent l="0" t="0" r="3810" b="3810"/>
+            <wp:docPr id="3" name="Imagen 3" descr="Interfaz de usuario gráfica, Icono&#10;&#10;El contenido generado por IA puede ser incorrecto."/>
+            <wp:cNvGraphicFramePr>
+              <a:graphicFrameLocks xmlns:a="http://schemas.openxmlformats.org/drawingml/2006/main" noChangeAspect="1"/>
+            </wp:cNvGraphicFramePr>
+            <a:graphic xmlns:a="http://schemas.openxmlformats.org/drawingml/2006/main">
+              <a:graphicData uri="http://schemas.openxmlformats.org/drawingml/2006/picture">
+                <pic:pic xmlns:pic="http://schemas.openxmlformats.org/drawingml/2006/picture">
+                  <pic:nvPicPr>
+                    <pic:cNvPr id="3" name="Imagen 3" descr="Interfaz de usuario gráfica, Icono&#10;&#10;El contenido generado por IA puede ser incorrecto."/>
+                    <pic:cNvPicPr/>
+                  </pic:nvPicPr>
+                  <pic:blipFill>
+                    <a:blip r:embed="rId24" cstate="print">
+                      <a:extLst>
+                        <a:ext uri="{28A0092B-C50C-407E-A947-70E740481C1C}">
+                          <a14:useLocalDpi xmlns:a14="http://schemas.microsoft.com/office/drawing/2010/main" val="0"/>
+                        </a:ext>
+                      </a:extLst>
+                    </a:blip>
+                    <a:stretch>
+                      <a:fillRect/>
+                    </a:stretch>
+                  </pic:blipFill>
+                  <pic:spPr>
+                    <a:xfrm>
+                      <a:off x="0" y="0"/>
+                      <a:ext cx="1664756" cy="1550220"/>
+                    </a:xfrm>
+                    <a:prstGeom prst="rect">
+                      <a:avLst/>
+                    </a:prstGeom>
+                  </pic:spPr>
+                </pic:pic>
+              </a:graphicData>
+            </a:graphic>
+          </wp:inline>
+        </w:drawing>
+      </w:r>
+    </w:p>
+    <w:p>
+      <w:pPr>
+        <w:pStyle w:val="Descripcin"/>
+        <w:jc w:val="center"/>
+        <w:rPr>
+          <w:rFonts w:ascii="Arial" w:hAnsi="Arial" w:cs="Arial"/>
+          <w:sz w:val="24"/>
+          <w:szCs w:val="24"/>
+        </w:rPr>
+      </w:pPr>
+      <w:bookmarkStart w:id="4" w:name="_Toc223685192"/>
+      <w:r>
+        <w:rPr>
+          <w:rFonts w:ascii="Arial" w:hAnsi="Arial" w:cs="Arial"/>
+          <w:sz w:val="24"/>
+          <w:szCs w:val="24"/>
+        </w:rPr>
+        <w:t xml:space="preserve">Ilustración </w:t>
+      </w:r>
+      <w:r>
+        <w:rPr>
+          <w:rFonts w:ascii="Arial" w:hAnsi="Arial" w:cs="Arial"/>
+          <w:sz w:val="24"/>
+          <w:szCs w:val="24"/>
+        </w:rPr>
+        <w:fldChar w:fldCharType="begin"/>
+      </w:r>
+      <w:r>
+        <w:rPr>
+          <w:rFonts w:ascii="Arial" w:hAnsi="Arial" w:cs="Arial"/>
+          <w:sz w:val="24"/>
+          <w:szCs w:val="24"/>
+        </w:rPr>
+        <w:instrText xml:space="preserve"> SEQ Ilustración \* ARABIC </w:instrText>
+      </w:r>
+      <w:r>
+        <w:rPr>
+          <w:rFonts w:ascii="Arial" w:hAnsi="Arial" w:cs="Arial"/>
+          <w:sz w:val="24"/>
+          <w:szCs w:val="24"/>
+        </w:rPr>
+        <w:fldChar w:fldCharType="separate"/>
+      </w:r>
+      <w:r>
+        <w:rPr>
+          <w:rFonts w:ascii="Arial" w:hAnsi="Arial" w:cs="Arial"/>
+          <w:noProof/>
+          <w:sz w:val="24"/>
+          <w:szCs w:val="24"/>
+        </w:rPr>
+        <w:t>5</w:t>
+      </w:r>
+      <w:r>
+        <w:rPr>
+          <w:rFonts w:ascii="Arial" w:hAnsi="Arial" w:cs="Arial"/>
+          <w:sz w:val="24"/>
+          <w:szCs w:val="24"/>
+        </w:rPr>
+        <w:fldChar w:fldCharType="end"/>
+      </w:r>
+      <w:r>
+        <w:rPr>
+          <w:rFonts w:ascii="Arial" w:hAnsi="Arial" w:cs="Arial"/>
+          <w:sz w:val="24"/>
+          <w:szCs w:val="24"/>
+        </w:rPr>
+        <w:t xml:space="preserve"> Microsoft Excel</w:t>
+      </w:r>
+      <w:bookmarkEnd w:id="4"/>
+    </w:p>
+    <w:p>
+      <w:pPr>
+        <w:rPr>
+          <w:rFonts w:ascii="Arial" w:hAnsi="Arial" w:cs="Arial"/>
+        </w:rPr>
+      </w:pPr>
+      <w:r>
+        <w:rPr>
+          <w:rFonts w:ascii="Arial" w:hAnsi="Arial" w:cs="Arial"/>
+        </w:rPr>
+        <w:t>He utilizado Excel para realizar la tabla de direcciones IP para toda la red del club</w:t>
+      </w:r>
+    </w:p>
+    <w:p>
+      <w:pPr>
+        <w:rPr>
+          <w:rFonts w:ascii="Arial" w:hAnsi="Arial" w:cs="Arial"/>
+        </w:rPr>
+      </w:pPr>
+    </w:p>
+    <w:p>
+      <w:pPr>
+        <w:jc w:val="center"/>
+        <w:rPr>
+          <w:rFonts w:ascii="Arial" w:hAnsi="Arial" w:cs="Arial"/>
+        </w:rPr>
+      </w:pPr>
+      <w:r>
+        <w:rPr>
+          <w:rFonts w:ascii="Arial" w:hAnsi="Arial" w:cs="Arial"/>
+          <w:noProof/>
+        </w:rPr>
+        <w:drawing>
+          <wp:inline distT="0" distB="0" distL="0" distR="0" wp14:anchorId="51BAC7C9" wp14:editId="29CB77F3">
+            <wp:extent cx="1783407" cy="1935480"/>
+            <wp:effectExtent l="0" t="0" r="7620" b="7620"/>
+            <wp:docPr id="6" name="Imagen 6" descr="Icono&#10;&#10;El contenido generado por IA puede ser incorrecto."/>
+            <wp:cNvGraphicFramePr>
+              <a:graphicFrameLocks xmlns:a="http://schemas.openxmlformats.org/drawingml/2006/main" noChangeAspect="1"/>
+            </wp:cNvGraphicFramePr>
+            <a:graphic xmlns:a="http://schemas.openxmlformats.org/drawingml/2006/main">
+              <a:graphicData uri="http://schemas.openxmlformats.org/drawingml/2006/picture">
+                <pic:pic xmlns:pic="http://schemas.openxmlformats.org/drawingml/2006/picture">
+                  <pic:nvPicPr>
+                    <pic:cNvPr id="6" name="Imagen 6" descr="Icono&#10;&#10;El contenido generado por IA puede ser incorrecto."/>
+                    <pic:cNvPicPr/>
+                  </pic:nvPicPr>
+                  <pic:blipFill>
+                    <a:blip r:embed="rId25" cstate="print">
+                      <a:extLst>
+                        <a:ext uri="{28A0092B-C50C-407E-A947-70E740481C1C}">
+                          <a14:useLocalDpi xmlns:a14="http://schemas.microsoft.com/office/drawing/2010/main" val="0"/>
+                        </a:ext>
+                      </a:extLst>
+                    </a:blip>
+                    <a:stretch>
+                      <a:fillRect/>
+                    </a:stretch>
+                  </pic:blipFill>
+                  <pic:spPr>
+                    <a:xfrm>
+                      <a:off x="0" y="0"/>
+                      <a:ext cx="1789285" cy="1941859"/>
+                    </a:xfrm>
+                    <a:prstGeom prst="rect">
+                      <a:avLst/>
+                    </a:prstGeom>
+                  </pic:spPr>
+                </pic:pic>
+              </a:graphicData>
+            </a:graphic>
+          </wp:inline>
+        </w:drawing>
+      </w:r>
+    </w:p>
+    <w:p>
+      <w:pPr>
+        <w:pStyle w:val="Descripcin"/>
+        <w:jc w:val="center"/>
+        <w:rPr>
+          <w:rFonts w:ascii="Arial" w:hAnsi="Arial" w:cs="Arial"/>
+          <w:sz w:val="24"/>
+          <w:szCs w:val="24"/>
+        </w:rPr>
+      </w:pPr>
+      <w:bookmarkStart w:id="5" w:name="_Toc223685193"/>
+      <w:r>
+        <w:rPr>
+          <w:rFonts w:ascii="Arial" w:hAnsi="Arial" w:cs="Arial"/>
+          <w:sz w:val="24"/>
+          <w:szCs w:val="24"/>
+        </w:rPr>
+        <w:t xml:space="preserve">Ilustración </w:t>
+      </w:r>
+      <w:r>
+        <w:rPr>
+          <w:rFonts w:ascii="Arial" w:hAnsi="Arial" w:cs="Arial"/>
+          <w:sz w:val="24"/>
+          <w:szCs w:val="24"/>
+        </w:rPr>
+        <w:fldChar w:fldCharType="begin"/>
+      </w:r>
+      <w:r>
+        <w:rPr>
+          <w:rFonts w:ascii="Arial" w:hAnsi="Arial" w:cs="Arial"/>
+          <w:sz w:val="24"/>
+          <w:szCs w:val="24"/>
+        </w:rPr>
+        <w:instrText xml:space="preserve"> SEQ Ilustración \* ARABIC </w:instrText>
+      </w:r>
+      <w:r>
+        <w:rPr>
+          <w:rFonts w:ascii="Arial" w:hAnsi="Arial" w:cs="Arial"/>
+          <w:sz w:val="24"/>
+          <w:szCs w:val="24"/>
+        </w:rPr>
+        <w:fldChar w:fldCharType="separate"/>
+      </w:r>
+      <w:r>
+        <w:rPr>
+          <w:rFonts w:ascii="Arial" w:hAnsi="Arial" w:cs="Arial"/>
+          <w:noProof/>
+          <w:sz w:val="24"/>
+          <w:szCs w:val="24"/>
+        </w:rPr>
+        <w:t>6</w:t>
+      </w:r>
+      <w:r>
+        <w:rPr>
+          <w:rFonts w:ascii="Arial" w:hAnsi="Arial" w:cs="Arial"/>
+          <w:sz w:val="24"/>
+          <w:szCs w:val="24"/>
+        </w:rPr>
+        <w:fldChar w:fldCharType="end"/>
+      </w:r>
+      <w:r>
+        <w:rPr>
+          <w:rFonts w:ascii="Arial" w:hAnsi="Arial" w:cs="Arial"/>
+          <w:sz w:val="24"/>
+          <w:szCs w:val="24"/>
+        </w:rPr>
+        <w:t xml:space="preserve"> Cisco Packet Tracert</w:t>
+      </w:r>
+      <w:bookmarkEnd w:id="5"/>
+    </w:p>
+    <w:p>
+      <w:pPr>
+        <w:rPr>
+          <w:rFonts w:ascii="Arial" w:hAnsi="Arial" w:cs="Arial"/>
+        </w:rPr>
+      </w:pPr>
+      <w:r>
+        <w:rPr>
+          <w:rFonts w:ascii="Arial" w:hAnsi="Arial" w:cs="Arial"/>
+        </w:rPr>
+        <w:t>He utilizado packet tracert para realizar el esquema y configuración de la red</w:t>
+      </w:r>
+    </w:p>
+    <w:p>
+      <w:pPr>
+        <w:spacing w:line="360" w:lineRule="auto"/>
+        <w:jc w:val="both"/>
+        <w:rPr>
+          <w:rFonts w:ascii="Arial" w:hAnsi="Arial" w:cs="Arial"/>
+          <w:color w:val="000000" w:themeColor="text1"/>
+          <w:sz w:val="32"/>
+          <w:szCs w:val="32"/>
+        </w:rPr>
+      </w:pPr>
+    </w:p>
+    <w:p>
+      <w:pPr>
+        <w:spacing w:line="360" w:lineRule="auto"/>
+        <w:jc w:val="both"/>
+        <w:rPr>
+          <w:rFonts w:ascii="Arial" w:hAnsi="Arial" w:cs="Arial"/>
+          <w:color w:val="000000" w:themeColor="text1"/>
+          <w:sz w:val="32"/>
+          <w:szCs w:val="32"/>
+        </w:rPr>
+      </w:pPr>
+      <w:r>
+        <w:rPr>
+          <w:rFonts w:ascii="Arial" w:hAnsi="Arial" w:cs="Arial"/>
+          <w:color w:val="000000" w:themeColor="text1"/>
+          <w:sz w:val="32"/>
+          <w:szCs w:val="32"/>
+        </w:rPr>
         <w:t>METODOLOGÍA</w:t>
       </w:r>
     </w:p>
@@ -4186,7 +5572,6 @@
           <w:bCs/>
           <w:color w:val="000000" w:themeColor="text1"/>
         </w:rPr>
-        <w:lastRenderedPageBreak/>
         <w:t xml:space="preserve">Diagrama de Gantt </w:t>
       </w:r>
       <w:r>
@@ -4210,6 +5595,7 @@
           <w:noProof/>
           <w:lang w:eastAsia="es-ES"/>
         </w:rPr>
+        <w:lastRenderedPageBreak/>
         <w:drawing>
           <wp:inline distT="0" distB="0" distL="0" distR="0" wp14:anchorId="3CD26B42" wp14:editId="7FE3AA8B">
             <wp:extent cx="4572000" cy="2333625"/>
@@ -4226,7 +5612,7 @@
                     <pic:cNvPicPr/>
                   </pic:nvPicPr>
                   <pic:blipFill>
-                    <a:blip r:embed="rId22">
+                    <a:blip r:embed="rId26">
                       <a:extLst>
                         <a:ext uri="{28A0092B-C50C-407E-A947-70E740481C1C}">
                           <a14:useLocalDpi xmlns:a14="http://schemas.microsoft.com/office/drawing/2010/main" val="0"/>
@@ -4539,7 +5925,7 @@
         </w:rPr>
         <w:t xml:space="preserve">Smith, J. (2023). La importancia del reciclaje en la conservación del medio ambiente. Recuperado de </w:t>
       </w:r>
-      <w:hyperlink r:id="rId23">
+      <w:hyperlink r:id="rId27">
         <w:r>
           <w:rPr>
             <w:rStyle w:val="Hipervnculo"/>
@@ -4663,12 +6049,12 @@
       </w:pPr>
     </w:p>
     <w:sectPr>
-      <w:headerReference w:type="even" r:id="rId24"/>
-      <w:headerReference w:type="default" r:id="rId25"/>
-      <w:footerReference w:type="even" r:id="rId26"/>
-      <w:footerReference w:type="default" r:id="rId27"/>
-      <w:headerReference w:type="first" r:id="rId28"/>
-      <w:footerReference w:type="first" r:id="rId29"/>
+      <w:headerReference w:type="even" r:id="rId28"/>
+      <w:headerReference w:type="default" r:id="rId29"/>
+      <w:footerReference w:type="even" r:id="rId30"/>
+      <w:footerReference w:type="default" r:id="rId31"/>
+      <w:headerReference w:type="first" r:id="rId32"/>
+      <w:footerReference w:type="first" r:id="rId33"/>
       <w:pgSz w:w="11906" w:h="16838"/>
       <w:pgMar w:top="1440" w:right="1440" w:bottom="1440" w:left="1440" w:header="720" w:footer="720" w:gutter="0"/>
       <w:cols w:space="720"/>
@@ -5948,6 +7334,17 @@
       <w:szCs w:val="18"/>
     </w:rPr>
   </w:style>
+  <w:style w:type="paragraph" w:styleId="Tabladeilustraciones">
+    <w:name w:val="table of figures"/>
+    <w:basedOn w:val="Normal"/>
+    <w:next w:val="Normal"/>
+    <w:uiPriority w:val="99"/>
+    <w:unhideWhenUsed/>
+    <w:rsid w:val="007427C4"/>
+    <w:pPr>
+      <w:spacing w:after="0"/>
+    </w:pPr>
+  </w:style>
 </w:styles>
 </file>
 
@@ -6213,15 +7610,6 @@
 </file>
 
 <file path=customXml/item1.xml><?xml version="1.0" encoding="utf-8"?>
-<?mso-contentType ?>
-<FormTemplates xmlns="http://schemas.microsoft.com/sharepoint/v3/contenttype/forms">
-  <Display>DocumentLibraryForm</Display>
-  <Edit>DocumentLibraryForm</Edit>
-  <New>DocumentLibraryForm</New>
-</FormTemplates>
-</file>
-
-<file path=customXml/item2.xml><?xml version="1.0" encoding="utf-8"?>
 <ct:contentTypeSchema xmlns:ct="http://schemas.microsoft.com/office/2006/metadata/contentType" xmlns:ma="http://schemas.microsoft.com/office/2006/metadata/properties/metaAttributes" ct:_="" ma:_="" ma:contentTypeName="Documento" ma:contentTypeID="0x0101008CD8C293B1B33442A2596F7F4EB4F7DA" ma:contentTypeVersion="13" ma:contentTypeDescription="Crear nuevo documento." ma:contentTypeScope="" ma:versionID="3fff2a8d346b842f093bb3701a245707">
   <xsd:schema xmlns:xsd="http://www.w3.org/2001/XMLSchema" xmlns:xs="http://www.w3.org/2001/XMLSchema" xmlns:p="http://schemas.microsoft.com/office/2006/metadata/properties" xmlns:ns2="439adc47-72d5-4f73-991c-913beebc2c9a" xmlns:ns3="59390006-c430-45d0-b76a-cc9d620cdd55" targetNamespace="http://schemas.microsoft.com/office/2006/metadata/properties" ma:root="true" ma:fieldsID="1598023d093cbc92eb58db4e954047a9" ns2:_="" ns3:_="">
     <xsd:import namespace="439adc47-72d5-4f73-991c-913beebc2c9a"/>
@@ -6444,7 +7832,20 @@
 </ct:contentTypeSchema>
 </file>
 
+<file path=customXml/item2.xml><?xml version="1.0" encoding="utf-8"?>
+<?mso-contentType ?>
+<FormTemplates xmlns="http://schemas.microsoft.com/sharepoint/v3/contenttype/forms">
+  <Display>DocumentLibraryForm</Display>
+  <Edit>DocumentLibraryForm</Edit>
+  <New>DocumentLibraryForm</New>
+</FormTemplates>
+</file>
+
 <file path=customXml/item3.xml><?xml version="1.0" encoding="utf-8"?>
+<b:Sources xmlns:b="http://schemas.openxmlformats.org/officeDocument/2006/bibliography" xmlns="http://schemas.openxmlformats.org/officeDocument/2006/bibliography" SelectedStyle="\APASixthEditionOfficeOnline.xsl" StyleName="APA" Version="6"/>
+</file>
+
+<file path=customXml/item4.xml><?xml version="1.0" encoding="utf-8"?>
 <p:properties xmlns:p="http://schemas.microsoft.com/office/2006/metadata/properties" xmlns:xsi="http://www.w3.org/2001/XMLSchema-instance" xmlns:pc="http://schemas.microsoft.com/office/infopath/2007/PartnerControls">
   <documentManagement>
     <TaxCatchAll xmlns="59390006-c430-45d0-b76a-cc9d620cdd55" xsi:nil="true"/>
@@ -6455,19 +7856,7 @@
 </p:properties>
 </file>
 
-<file path=customXml/item4.xml><?xml version="1.0" encoding="utf-8"?>
-<b:Sources xmlns:b="http://schemas.openxmlformats.org/officeDocument/2006/bibliography" xmlns="http://schemas.openxmlformats.org/officeDocument/2006/bibliography" SelectedStyle="\APASixthEditionOfficeOnline.xsl" StyleName="APA" Version="6"/>
-</file>
-
 <file path=customXml/itemProps1.xml><?xml version="1.0" encoding="utf-8"?>
-<ds:datastoreItem xmlns:ds="http://schemas.openxmlformats.org/officeDocument/2006/customXml" ds:itemID="{42E3C8EC-5B10-45B3-8E97-FBD6324B8BB9}">
-  <ds:schemaRefs>
-    <ds:schemaRef ds:uri="http://schemas.microsoft.com/sharepoint/v3/contenttype/forms"/>
-  </ds:schemaRefs>
-</ds:datastoreItem>
-</file>
-
-<file path=customXml/itemProps2.xml><?xml version="1.0" encoding="utf-8"?>
 <ds:datastoreItem xmlns:ds="http://schemas.openxmlformats.org/officeDocument/2006/customXml" ds:itemID="{B56C9B97-3894-4B38-A6AD-295A7F0C1DBC}">
   <ds:schemaRefs>
     <ds:schemaRef ds:uri="http://schemas.microsoft.com/office/2006/metadata/contentType"/>
@@ -6486,7 +7875,23 @@
 </ds:datastoreItem>
 </file>
 
+<file path=customXml/itemProps2.xml><?xml version="1.0" encoding="utf-8"?>
+<ds:datastoreItem xmlns:ds="http://schemas.openxmlformats.org/officeDocument/2006/customXml" ds:itemID="{42E3C8EC-5B10-45B3-8E97-FBD6324B8BB9}">
+  <ds:schemaRefs>
+    <ds:schemaRef ds:uri="http://schemas.microsoft.com/sharepoint/v3/contenttype/forms"/>
+  </ds:schemaRefs>
+</ds:datastoreItem>
+</file>
+
 <file path=customXml/itemProps3.xml><?xml version="1.0" encoding="utf-8"?>
+<ds:datastoreItem xmlns:ds="http://schemas.openxmlformats.org/officeDocument/2006/customXml" ds:itemID="{4DCDDEEF-4063-457A-9E32-4CEA8C90D2ED}">
+  <ds:schemaRefs>
+    <ds:schemaRef ds:uri="http://schemas.openxmlformats.org/officeDocument/2006/bibliography"/>
+  </ds:schemaRefs>
+</ds:datastoreItem>
+</file>
+
+<file path=customXml/itemProps4.xml><?xml version="1.0" encoding="utf-8"?>
 <ds:datastoreItem xmlns:ds="http://schemas.openxmlformats.org/officeDocument/2006/customXml" ds:itemID="{BCDA797D-315A-42FB-BB9A-CCFA3A760578}">
   <ds:schemaRefs>
     <ds:schemaRef ds:uri="http://schemas.microsoft.com/office/2006/metadata/properties"/>
@@ -6495,12 +7900,4 @@
     <ds:schemaRef ds:uri="439adc47-72d5-4f73-991c-913beebc2c9a"/>
   </ds:schemaRefs>
 </ds:datastoreItem>
-</file>
-
-<file path=customXml/itemProps4.xml><?xml version="1.0" encoding="utf-8"?>
-<ds:datastoreItem xmlns:ds="http://schemas.openxmlformats.org/officeDocument/2006/customXml" ds:itemID="{4DCDDEEF-4063-457A-9E32-4CEA8C90D2ED}">
-  <ds:schemaRefs>
-    <ds:schemaRef ds:uri="http://schemas.openxmlformats.org/officeDocument/2006/bibliography"/>
-  </ds:schemaRefs>
-</ds:datastoreItem>
 </file>
</xml_diff>